<commit_message>
Update resume files (Raahi Global links), client work section, and mobile styles
</commit_message>
<xml_diff>
--- a/public/Santhosh_Krishna_R_Resume.docx
+++ b/public/Santhosh_Krishna_R_Resume.docx
@@ -4,7 +4,7 @@
   <w:body>
     <w:p>
       <w:pPr>
-        <w:spacing w:after="0" w:line="320" w:lineRule="exact"/>
+        <w:spacing w:after="0" w:line="240" w:lineRule="auto"/>
         <w:jc w:val="center"/>
       </w:pPr>
       <w:r>
@@ -215,6 +215,11 @@
     <w:p>
       <w:pPr>
         <w:spacing w:after="0"/>
+        <w:rPr>
+          <w:rFonts w:ascii="Calibri" w:hAnsi="Calibri"/>
+          <w:color w:val="222222"/>
+          <w:sz w:val="20"/>
+        </w:rPr>
       </w:pPr>
       <w:r>
         <w:rPr>
@@ -236,11 +241,417 @@
     </w:p>
     <w:p>
       <w:pPr>
+        <w:spacing w:after="0"/>
+        <w:rPr>
+          <w:rFonts w:ascii="Calibri" w:hAnsi="Calibri"/>
+          <w:color w:val="222222"/>
+          <w:sz w:val="20"/>
+        </w:rPr>
+      </w:pPr>
+      <w:r>
+        <w:rPr>
+          <w:rFonts w:ascii="Calibri" w:hAnsi="Calibri"/>
+          <w:noProof/>
+          <w:color w:val="222222"/>
+          <w:sz w:val="20"/>
+        </w:rPr>
+        <mc:AlternateContent>
+          <mc:Choice Requires="wps">
+            <w:drawing>
+              <wp:anchor distT="0" distB="0" distL="114300" distR="114300" simplePos="0" relativeHeight="251659264" behindDoc="0" locked="0" layoutInCell="1" allowOverlap="1" wp14:anchorId="4273993F" wp14:editId="124CDE1F">
+                <wp:simplePos x="0" y="0"/>
+                <wp:positionH relativeFrom="margin">
+                  <wp:align>center</wp:align>
+                </wp:positionH>
+                <wp:positionV relativeFrom="paragraph">
+                  <wp:posOffset>86360</wp:posOffset>
+                </wp:positionV>
+                <wp:extent cx="6467475" cy="9525"/>
+                <wp:effectExtent l="38100" t="38100" r="66675" b="85725"/>
+                <wp:wrapNone/>
+                <wp:docPr id="1" name="Straight Connector 1"/>
+                <wp:cNvGraphicFramePr/>
+                <a:graphic xmlns:a="http://schemas.openxmlformats.org/drawingml/2006/main">
+                  <a:graphicData uri="http://schemas.microsoft.com/office/word/2010/wordprocessingShape">
+                    <wps:wsp>
+                      <wps:cNvCnPr/>
+                      <wps:spPr>
+                        <a:xfrm flipV="1">
+                          <a:off x="0" y="0"/>
+                          <a:ext cx="6467475" cy="9525"/>
+                        </a:xfrm>
+                        <a:prstGeom prst="line">
+                          <a:avLst/>
+                        </a:prstGeom>
+                      </wps:spPr>
+                      <wps:style>
+                        <a:lnRef idx="2">
+                          <a:schemeClr val="accent1"/>
+                        </a:lnRef>
+                        <a:fillRef idx="0">
+                          <a:schemeClr val="accent1"/>
+                        </a:fillRef>
+                        <a:effectRef idx="1">
+                          <a:schemeClr val="accent1"/>
+                        </a:effectRef>
+                        <a:fontRef idx="minor">
+                          <a:schemeClr val="tx1"/>
+                        </a:fontRef>
+                      </wps:style>
+                      <wps:bodyPr/>
+                    </wps:wsp>
+                  </a:graphicData>
+                </a:graphic>
+              </wp:anchor>
+            </w:drawing>
+          </mc:Choice>
+          <mc:Fallback>
+            <w:pict>
+              <v:line w14:anchorId="10A6E40F" id="Straight Connector 1" o:spid="_x0000_s1026" style="position:absolute;flip:y;z-index:251659264;visibility:visible;mso-wrap-style:square;mso-wrap-distance-left:9pt;mso-wrap-distance-top:0;mso-wrap-distance-right:9pt;mso-wrap-distance-bottom:0;mso-position-horizontal:center;mso-position-horizontal-relative:margin;mso-position-vertical:absolute;mso-position-vertical-relative:text" from="0,6.8pt" to="509.25pt,7.55pt" o:gfxdata="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" strokecolor="#4f81bd [3204]" strokeweight="2pt">
+                <v:shadow on="t" color="black" opacity="24903f" origin=",.5" offset="0,.55556mm"/>
+                <w10:wrap anchorx="margin"/>
+              </v:line>
+            </w:pict>
+          </mc:Fallback>
+        </mc:AlternateContent>
+      </w:r>
+    </w:p>
+    <w:p>
+      <w:pPr>
         <w:keepNext/>
         <w:pBdr>
-          <w:bottom w:val="single" w:sz="4" w:space="1" w:color="0D6B6B"/>
+          <w:bottom w:val="single" w:sz="4" w:space="0" w:color="0D6B6B"/>
         </w:pBdr>
         <w:spacing w:before="60" w:after="0"/>
+        <w:rPr>
+          <w:rFonts w:ascii="Calibri" w:hAnsi="Calibri"/>
+          <w:b/>
+          <w:bCs/>
+          <w:color w:val="1A1A1A"/>
+          <w:lang w:val="en-IN"/>
+        </w:rPr>
+      </w:pPr>
+      <w:r>
+        <w:rPr>
+          <w:rFonts w:ascii="Calibri" w:hAnsi="Calibri" w:cs="Calibri"/>
+          <w:b/>
+          <w:bCs/>
+          <w:color w:val="0D6B6B"/>
+          <w:lang w:val="en-IN"/>
+        </w:rPr>
+        <w:t>CLIENT PROJECT EXPERIENCE</w:t>
+      </w:r>
+    </w:p>
+    <w:p>
+      <w:pPr>
+        <w:spacing w:after="0"/>
+        <w:rPr>
+          <w:rFonts w:ascii="Calibri" w:hAnsi="Calibri"/>
+          <w:b/>
+          <w:color w:val="1A1A1A"/>
+          <w:lang w:val="en-IN"/>
+        </w:rPr>
+      </w:pPr>
+      <w:r>
+        <w:rPr>
+          <w:rFonts w:ascii="Calibri" w:hAnsi="Calibri"/>
+          <w:b/>
+          <w:bCs/>
+          <w:color w:val="1A1A1A"/>
+          <w:lang w:val="en-IN"/>
+        </w:rPr>
+        <w:t>Raahi Global — Client Project | German Language Learning Platform</w:t>
+      </w:r>
+      <w:r>
+        <w:rPr>
+          <w:rFonts w:ascii="Calibri" w:hAnsi="Calibri"/>
+          <w:b/>
+          <w:color w:val="1A1A1A"/>
+          <w:lang w:val="en-IN"/>
+        </w:rPr>
+        <w:br/>
+      </w:r>
+      <w:r>
+        <w:rPr>
+          <w:rFonts w:ascii="Calibri" w:hAnsi="Calibri"/>
+          <w:b/>
+          <w:i/>
+          <w:iCs/>
+          <w:color w:val="1A1A1A"/>
+          <w:lang w:val="en-IN"/>
+        </w:rPr>
+        <w:t>Flutter  •  Dart  •  Firebase Authentication  •  Cloud Firestore  •  Firebase Cloud Messaging  •  Riverpod  •  GoRouter</w:t>
+      </w:r>
+    </w:p>
+    <w:p>
+      <w:pPr>
+        <w:numPr>
+          <w:ilvl w:val="0"/>
+          <w:numId w:val="10"/>
+        </w:numPr>
+        <w:spacing w:after="0"/>
+        <w:rPr>
+          <w:rFonts w:ascii="Calibri" w:hAnsi="Calibri"/>
+          <w:b/>
+          <w:color w:val="1A1A1A"/>
+          <w:lang w:val="en-IN"/>
+        </w:rPr>
+      </w:pPr>
+      <w:r>
+        <w:rPr>
+          <w:rFonts w:ascii="Calibri" w:hAnsi="Calibri"/>
+          <w:b/>
+          <w:color w:val="1A1A1A"/>
+          <w:lang w:val="en-IN"/>
+        </w:rPr>
+        <w:t>Developed a cross-platform Flutter application for a German language learning and student support platform.</w:t>
+      </w:r>
+    </w:p>
+    <w:p>
+      <w:pPr>
+        <w:numPr>
+          <w:ilvl w:val="0"/>
+          <w:numId w:val="10"/>
+        </w:numPr>
+        <w:spacing w:after="0"/>
+        <w:rPr>
+          <w:rFonts w:ascii="Calibri" w:hAnsi="Calibri"/>
+          <w:b/>
+          <w:color w:val="1A1A1A"/>
+          <w:lang w:val="en-IN"/>
+        </w:rPr>
+      </w:pPr>
+      <w:r>
+        <w:rPr>
+          <w:rFonts w:ascii="Calibri" w:hAnsi="Calibri"/>
+          <w:b/>
+          <w:color w:val="1A1A1A"/>
+          <w:lang w:val="en-IN"/>
+        </w:rPr>
+        <w:t>Implemented student onboarding, profile completion, course enrollment, and structured A1–B2 learning content.</w:t>
+      </w:r>
+    </w:p>
+    <w:p>
+      <w:pPr>
+        <w:numPr>
+          <w:ilvl w:val="0"/>
+          <w:numId w:val="10"/>
+        </w:numPr>
+        <w:spacing w:after="0"/>
+        <w:rPr>
+          <w:rFonts w:ascii="Calibri" w:hAnsi="Calibri"/>
+          <w:b/>
+          <w:color w:val="1A1A1A"/>
+          <w:lang w:val="en-IN"/>
+        </w:rPr>
+      </w:pPr>
+      <w:r>
+        <w:rPr>
+          <w:rFonts w:ascii="Calibri" w:hAnsi="Calibri"/>
+          <w:b/>
+          <w:color w:val="1A1A1A"/>
+          <w:lang w:val="en-IN"/>
+        </w:rPr>
+        <w:t>Integrated Firebase Authentication and Cloud Firestore for secure authentication and application data management.</w:t>
+      </w:r>
+    </w:p>
+    <w:p>
+      <w:pPr>
+        <w:numPr>
+          <w:ilvl w:val="0"/>
+          <w:numId w:val="10"/>
+        </w:numPr>
+        <w:spacing w:after="0"/>
+        <w:rPr>
+          <w:rFonts w:ascii="Calibri" w:hAnsi="Calibri"/>
+          <w:b/>
+          <w:color w:val="1A1A1A"/>
+          <w:lang w:val="en-IN"/>
+        </w:rPr>
+      </w:pPr>
+      <w:r>
+        <w:rPr>
+          <w:rFonts w:ascii="Calibri" w:hAnsi="Calibri"/>
+          <w:b/>
+          <w:color w:val="1A1A1A"/>
+          <w:lang w:val="en-IN"/>
+        </w:rPr>
+        <w:t>Built role-based interfaces and an admin dashboard for managing platform content and student workflows.</w:t>
+      </w:r>
+    </w:p>
+    <w:p>
+      <w:pPr>
+        <w:numPr>
+          <w:ilvl w:val="0"/>
+          <w:numId w:val="10"/>
+        </w:numPr>
+        <w:spacing w:after="0"/>
+        <w:rPr>
+          <w:rFonts w:ascii="Calibri" w:hAnsi="Calibri"/>
+          <w:b/>
+          <w:color w:val="1A1A1A"/>
+          <w:lang w:val="en-IN"/>
+        </w:rPr>
+      </w:pPr>
+      <w:r>
+        <w:rPr>
+          <w:rFonts w:ascii="Calibri" w:hAnsi="Calibri"/>
+          <w:b/>
+          <w:color w:val="1A1A1A"/>
+          <w:lang w:val="en-IN"/>
+        </w:rPr>
+        <w:t>Integrated Firebase Cloud Messaging for push notifications and GoRouter for in-app navigation.</w:t>
+      </w:r>
+    </w:p>
+    <w:p>
+      <w:pPr>
+        <w:numPr>
+          <w:ilvl w:val="0"/>
+          <w:numId w:val="10"/>
+        </w:numPr>
+        <w:spacing w:after="0"/>
+        <w:rPr>
+          <w:rFonts w:ascii="Calibri" w:hAnsi="Calibri"/>
+          <w:b/>
+          <w:color w:val="1A1A1A"/>
+          <w:lang w:val="en-IN"/>
+        </w:rPr>
+      </w:pPr>
+      <w:r>
+        <w:rPr>
+          <w:rFonts w:ascii="Calibri" w:hAnsi="Calibri"/>
+          <w:b/>
+          <w:color w:val="1A1A1A"/>
+          <w:lang w:val="en-IN"/>
+        </w:rPr>
+        <w:t>Prepared versioned release builds and supported the testing and Google Play deployment workflow.</w:t>
+      </w:r>
+    </w:p>
+    <w:p>
+      <w:pPr>
+        <w:spacing w:after="0"/>
+        <w:rPr>
+          <w:rFonts w:ascii="Calibri" w:hAnsi="Calibri"/>
+          <w:b/>
+          <w:color w:val="1A1A1A"/>
+          <w:lang w:val="en-IN"/>
+        </w:rPr>
+      </w:pPr>
+      <w:hyperlink r:id="rId8" w:history="1">
+        <w:r>
+          <w:rPr>
+            <w:rStyle w:val="Hyperlink"/>
+            <w:rFonts w:ascii="Calibri" w:hAnsi="Calibri"/>
+            <w:b/>
+            <w:lang w:val="en-IN"/>
+          </w:rPr>
+          <w:t>GitHub</w:t>
+        </w:r>
+      </w:hyperlink>
+      <w:r>
+        <w:rPr>
+          <w:rFonts w:ascii="Calibri" w:hAnsi="Calibri"/>
+          <w:b/>
+          <w:color w:val="1A1A1A"/>
+          <w:lang w:val="en-IN"/>
+        </w:rPr>
+        <w:t xml:space="preserve"> | </w:t>
+      </w:r>
+      <w:hyperlink r:id="rId9" w:history="1">
+        <w:r>
+          <w:rPr>
+            <w:rStyle w:val="Hyperlink"/>
+            <w:b/>
+            <w:lang w:val="en-IN"/>
+          </w:rPr>
+          <w:t>Google Play Store</w:t>
+        </w:r>
+      </w:hyperlink>
+    </w:p>
+    <w:p>
+      <w:pPr>
+        <w:spacing w:after="0"/>
+      </w:pPr>
+      <w:r>
+        <w:rPr>
+          <w:rFonts w:ascii="Calibri" w:hAnsi="Calibri"/>
+          <w:noProof/>
+          <w:color w:val="222222"/>
+          <w:sz w:val="20"/>
+        </w:rPr>
+        <mc:AlternateContent>
+          <mc:Choice Requires="wps">
+            <w:drawing>
+              <wp:anchor distT="0" distB="0" distL="114300" distR="114300" simplePos="0" relativeHeight="251661312" behindDoc="0" locked="0" layoutInCell="1" allowOverlap="1" wp14:anchorId="695667B0" wp14:editId="5104F75D">
+                <wp:simplePos x="0" y="0"/>
+                <wp:positionH relativeFrom="margin">
+                  <wp:posOffset>47625</wp:posOffset>
+                </wp:positionH>
+                <wp:positionV relativeFrom="paragraph">
+                  <wp:posOffset>107950</wp:posOffset>
+                </wp:positionV>
+                <wp:extent cx="6467475" cy="9525"/>
+                <wp:effectExtent l="38100" t="38100" r="66675" b="85725"/>
+                <wp:wrapNone/>
+                <wp:docPr id="2" name="Straight Connector 2"/>
+                <wp:cNvGraphicFramePr/>
+                <a:graphic xmlns:a="http://schemas.openxmlformats.org/drawingml/2006/main">
+                  <a:graphicData uri="http://schemas.microsoft.com/office/word/2010/wordprocessingShape">
+                    <wps:wsp>
+                      <wps:cNvCnPr/>
+                      <wps:spPr>
+                        <a:xfrm flipV="1">
+                          <a:off x="0" y="0"/>
+                          <a:ext cx="6467475" cy="9525"/>
+                        </a:xfrm>
+                        <a:prstGeom prst="line">
+                          <a:avLst/>
+                        </a:prstGeom>
+                      </wps:spPr>
+                      <wps:style>
+                        <a:lnRef idx="2">
+                          <a:schemeClr val="accent1"/>
+                        </a:lnRef>
+                        <a:fillRef idx="0">
+                          <a:schemeClr val="accent1"/>
+                        </a:fillRef>
+                        <a:effectRef idx="1">
+                          <a:schemeClr val="accent1"/>
+                        </a:effectRef>
+                        <a:fontRef idx="minor">
+                          <a:schemeClr val="tx1"/>
+                        </a:fontRef>
+                      </wps:style>
+                      <wps:bodyPr/>
+                    </wps:wsp>
+                  </a:graphicData>
+                </a:graphic>
+              </wp:anchor>
+            </w:drawing>
+          </mc:Choice>
+          <mc:Fallback>
+            <w:pict>
+              <v:line w14:anchorId="29BD9613" id="Straight Connector 2" o:spid="_x0000_s1026" style="position:absolute;flip:y;z-index:251661312;visibility:visible;mso-wrap-style:square;mso-wrap-distance-left:9pt;mso-wrap-distance-top:0;mso-wrap-distance-right:9pt;mso-wrap-distance-bottom:0;mso-position-horizontal:absolute;mso-position-horizontal-relative:margin;mso-position-vertical:absolute;mso-position-vertical-relative:text" from="3.75pt,8.5pt" to="513pt,9.25pt" o:gfxdata="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" strokecolor="#4f81bd [3204]" strokeweight="2pt">
+                <v:shadow on="t" color="black" opacity="24903f" origin=",.5" offset="0,.55556mm"/>
+                <w10:wrap anchorx="margin"/>
+              </v:line>
+            </w:pict>
+          </mc:Fallback>
+        </mc:AlternateContent>
+      </w:r>
+    </w:p>
+    <w:p>
+      <w:pPr>
+        <w:keepNext/>
+        <w:pBdr>
+          <w:bottom w:val="single" w:sz="4" w:space="0" w:color="0D6B6B"/>
+        </w:pBdr>
+        <w:spacing w:before="60" w:after="0"/>
+        <w:rPr>
+          <w:rFonts w:ascii="Calibri" w:hAnsi="Calibri"/>
+          <w:b/>
+          <w:color w:val="0D6B6B"/>
+        </w:rPr>
       </w:pPr>
       <w:r>
         <w:rPr>
@@ -352,7 +763,7 @@
         <w:spacing w:after="20"/>
         <w:ind w:left="283"/>
       </w:pPr>
-      <w:hyperlink r:id="rId8">
+      <w:hyperlink r:id="rId10">
         <w:r>
           <w:rPr>
             <w:rFonts w:ascii="Calibri" w:hAnsi="Calibri"/>
@@ -371,7 +782,7 @@
         </w:rPr>
         <w:t xml:space="preserve">  •  </w:t>
       </w:r>
-      <w:hyperlink r:id="rId9">
+      <w:hyperlink r:id="rId11">
         <w:r>
           <w:rPr>
             <w:rFonts w:ascii="Calibri" w:hAnsi="Calibri"/>
@@ -484,7 +895,7 @@
         <w:spacing w:after="20"/>
         <w:ind w:left="283"/>
       </w:pPr>
-      <w:hyperlink r:id="rId10">
+      <w:hyperlink r:id="rId12">
         <w:r>
           <w:rPr>
             <w:rFonts w:ascii="Calibri" w:hAnsi="Calibri"/>
@@ -520,6 +931,7 @@
           <w:color w:val="666666"/>
           <w:sz w:val="18"/>
         </w:rPr>
+        <w:lastRenderedPageBreak/>
         <w:t>Next.js  •  TypeScript  •  Tailwind CSS  •  Vercel</w:t>
       </w:r>
     </w:p>
@@ -590,138 +1002,6 @@
           <w:sz w:val="20"/>
         </w:rPr>
         <w:t>•  Integrated Vercel deployment workflow</w:t>
-      </w:r>
-    </w:p>
-    <w:p>
-      <w:pPr>
-        <w:spacing w:after="20"/>
-        <w:ind w:left="283"/>
-      </w:pPr>
-      <w:hyperlink r:id="rId11">
-        <w:r>
-          <w:rPr>
-            <w:rFonts w:ascii="Calibri" w:hAnsi="Calibri"/>
-            <w:color w:val="0D6B6B"/>
-            <w:sz w:val="18"/>
-            <w:u w:val="single"/>
-          </w:rPr>
-          <w:t>GitHub</w:t>
-        </w:r>
-      </w:hyperlink>
-      <w:r>
-        <w:rPr>
-          <w:rFonts w:ascii="Calibri" w:hAnsi="Calibri"/>
-          <w:color w:val="666666"/>
-          <w:sz w:val="18"/>
-        </w:rPr>
-        <w:t xml:space="preserve">  •  </w:t>
-      </w:r>
-      <w:hyperlink r:id="rId12">
-        <w:r>
-          <w:rPr>
-            <w:rFonts w:ascii="Calibri" w:hAnsi="Calibri"/>
-            <w:color w:val="0D6B6B"/>
-            <w:sz w:val="18"/>
-            <w:u w:val="single"/>
-          </w:rPr>
-          <w:t>Live Website</w:t>
-        </w:r>
-      </w:hyperlink>
-    </w:p>
-    <w:p>
-      <w:pPr>
-        <w:spacing w:before="40" w:after="0"/>
-      </w:pPr>
-      <w:r>
-        <w:rPr>
-          <w:rFonts w:ascii="Calibri" w:hAnsi="Calibri"/>
-          <w:b/>
-          <w:color w:val="1A1A1A"/>
-        </w:rPr>
-        <w:t>Perfect Care Salon Website</w:t>
-      </w:r>
-    </w:p>
-    <w:p>
-      <w:pPr>
-        <w:spacing w:after="0"/>
-      </w:pPr>
-      <w:r>
-        <w:rPr>
-          <w:rFonts w:ascii="Calibri" w:hAnsi="Calibri"/>
-          <w:i/>
-          <w:color w:val="666666"/>
-          <w:sz w:val="18"/>
-        </w:rPr>
-        <w:t>Next.js  •  TypeScript  •  Tailwind CSS  •  Vercel</w:t>
-      </w:r>
-    </w:p>
-    <w:p>
-      <w:pPr>
-        <w:spacing w:after="0"/>
-      </w:pPr>
-      <w:r>
-        <w:rPr>
-          <w:rFonts w:ascii="Calibri" w:hAnsi="Calibri"/>
-          <w:color w:val="222222"/>
-          <w:sz w:val="20"/>
-        </w:rPr>
-        <w:t>Created a modern responsive salon website focused on frontend optimization and professional UI presentation.</w:t>
-      </w:r>
-    </w:p>
-    <w:p>
-      <w:pPr>
-        <w:spacing w:after="0"/>
-        <w:ind w:left="283"/>
-      </w:pPr>
-      <w:r>
-        <w:rPr>
-          <w:rFonts w:ascii="Calibri" w:hAnsi="Calibri"/>
-          <w:color w:val="222222"/>
-          <w:sz w:val="20"/>
-        </w:rPr>
-        <w:t>•  Developed responsive layouts</w:t>
-      </w:r>
-    </w:p>
-    <w:p>
-      <w:pPr>
-        <w:spacing w:after="0"/>
-        <w:ind w:left="283"/>
-      </w:pPr>
-      <w:r>
-        <w:rPr>
-          <w:rFonts w:ascii="Calibri" w:hAnsi="Calibri"/>
-          <w:color w:val="222222"/>
-          <w:sz w:val="20"/>
-        </w:rPr>
-        <w:t>•  Designed service showcase sections</w:t>
-      </w:r>
-    </w:p>
-    <w:p>
-      <w:pPr>
-        <w:spacing w:after="0"/>
-        <w:ind w:left="283"/>
-      </w:pPr>
-      <w:r>
-        <w:rPr>
-          <w:rFonts w:ascii="Calibri" w:hAnsi="Calibri"/>
-          <w:color w:val="222222"/>
-          <w:sz w:val="20"/>
-        </w:rPr>
-        <w:t>•  Optimized frontend performance</w:t>
-      </w:r>
-    </w:p>
-    <w:p>
-      <w:pPr>
-        <w:spacing w:after="0"/>
-        <w:ind w:left="283"/>
-      </w:pPr>
-      <w:r>
-        <w:rPr>
-          <w:rFonts w:ascii="Calibri" w:hAnsi="Calibri"/>
-          <w:color w:val="222222"/>
-          <w:sz w:val="20"/>
-        </w:rPr>
-        <w:t>•  Managed Vercel deployment</w:t>
       </w:r>
     </w:p>
     <w:p>
@@ -887,7 +1167,6 @@
           <w:b/>
           <w:color w:val="0D6B6B"/>
         </w:rPr>
-        <w:lastRenderedPageBreak/>
         <w:t>LANGUAGES</w:t>
       </w:r>
     </w:p>
@@ -1087,6 +1366,155 @@
       </w:rPr>
     </w:lvl>
   </w:abstractNum>
+  <w:abstractNum w:abstractNumId="9" w15:restartNumberingAfterBreak="0">
+    <w:nsid w:val="775B353F"/>
+    <w:multiLevelType w:val="multilevel"/>
+    <w:tmpl w:val="DD9AFDCE"/>
+    <w:lvl w:ilvl="0">
+      <w:start w:val="1"/>
+      <w:numFmt w:val="bullet"/>
+      <w:lvlText w:val=""/>
+      <w:lvlJc w:val="left"/>
+      <w:pPr>
+        <w:tabs>
+          <w:tab w:val="num" w:pos="720"/>
+        </w:tabs>
+        <w:ind w:left="720" w:hanging="360"/>
+      </w:pPr>
+      <w:rPr>
+        <w:rFonts w:ascii="Symbol" w:hAnsi="Symbol" w:hint="default"/>
+        <w:sz w:val="20"/>
+      </w:rPr>
+    </w:lvl>
+    <w:lvl w:ilvl="1" w:tentative="1">
+      <w:start w:val="1"/>
+      <w:numFmt w:val="bullet"/>
+      <w:lvlText w:val="o"/>
+      <w:lvlJc w:val="left"/>
+      <w:pPr>
+        <w:tabs>
+          <w:tab w:val="num" w:pos="1440"/>
+        </w:tabs>
+        <w:ind w:left="1440" w:hanging="360"/>
+      </w:pPr>
+      <w:rPr>
+        <w:rFonts w:ascii="Courier New" w:hAnsi="Courier New" w:hint="default"/>
+        <w:sz w:val="20"/>
+      </w:rPr>
+    </w:lvl>
+    <w:lvl w:ilvl="2" w:tentative="1">
+      <w:start w:val="1"/>
+      <w:numFmt w:val="bullet"/>
+      <w:lvlText w:val=""/>
+      <w:lvlJc w:val="left"/>
+      <w:pPr>
+        <w:tabs>
+          <w:tab w:val="num" w:pos="2160"/>
+        </w:tabs>
+        <w:ind w:left="2160" w:hanging="360"/>
+      </w:pPr>
+      <w:rPr>
+        <w:rFonts w:ascii="Wingdings" w:hAnsi="Wingdings" w:hint="default"/>
+        <w:sz w:val="20"/>
+      </w:rPr>
+    </w:lvl>
+    <w:lvl w:ilvl="3" w:tentative="1">
+      <w:start w:val="1"/>
+      <w:numFmt w:val="bullet"/>
+      <w:lvlText w:val=""/>
+      <w:lvlJc w:val="left"/>
+      <w:pPr>
+        <w:tabs>
+          <w:tab w:val="num" w:pos="2880"/>
+        </w:tabs>
+        <w:ind w:left="2880" w:hanging="360"/>
+      </w:pPr>
+      <w:rPr>
+        <w:rFonts w:ascii="Wingdings" w:hAnsi="Wingdings" w:hint="default"/>
+        <w:sz w:val="20"/>
+      </w:rPr>
+    </w:lvl>
+    <w:lvl w:ilvl="4" w:tentative="1">
+      <w:start w:val="1"/>
+      <w:numFmt w:val="bullet"/>
+      <w:lvlText w:val=""/>
+      <w:lvlJc w:val="left"/>
+      <w:pPr>
+        <w:tabs>
+          <w:tab w:val="num" w:pos="3600"/>
+        </w:tabs>
+        <w:ind w:left="3600" w:hanging="360"/>
+      </w:pPr>
+      <w:rPr>
+        <w:rFonts w:ascii="Wingdings" w:hAnsi="Wingdings" w:hint="default"/>
+        <w:sz w:val="20"/>
+      </w:rPr>
+    </w:lvl>
+    <w:lvl w:ilvl="5" w:tentative="1">
+      <w:start w:val="1"/>
+      <w:numFmt w:val="bullet"/>
+      <w:lvlText w:val=""/>
+      <w:lvlJc w:val="left"/>
+      <w:pPr>
+        <w:tabs>
+          <w:tab w:val="num" w:pos="4320"/>
+        </w:tabs>
+        <w:ind w:left="4320" w:hanging="360"/>
+      </w:pPr>
+      <w:rPr>
+        <w:rFonts w:ascii="Wingdings" w:hAnsi="Wingdings" w:hint="default"/>
+        <w:sz w:val="20"/>
+      </w:rPr>
+    </w:lvl>
+    <w:lvl w:ilvl="6" w:tentative="1">
+      <w:start w:val="1"/>
+      <w:numFmt w:val="bullet"/>
+      <w:lvlText w:val=""/>
+      <w:lvlJc w:val="left"/>
+      <w:pPr>
+        <w:tabs>
+          <w:tab w:val="num" w:pos="5040"/>
+        </w:tabs>
+        <w:ind w:left="5040" w:hanging="360"/>
+      </w:pPr>
+      <w:rPr>
+        <w:rFonts w:ascii="Wingdings" w:hAnsi="Wingdings" w:hint="default"/>
+        <w:sz w:val="20"/>
+      </w:rPr>
+    </w:lvl>
+    <w:lvl w:ilvl="7" w:tentative="1">
+      <w:start w:val="1"/>
+      <w:numFmt w:val="bullet"/>
+      <w:lvlText w:val=""/>
+      <w:lvlJc w:val="left"/>
+      <w:pPr>
+        <w:tabs>
+          <w:tab w:val="num" w:pos="5760"/>
+        </w:tabs>
+        <w:ind w:left="5760" w:hanging="360"/>
+      </w:pPr>
+      <w:rPr>
+        <w:rFonts w:ascii="Wingdings" w:hAnsi="Wingdings" w:hint="default"/>
+        <w:sz w:val="20"/>
+      </w:rPr>
+    </w:lvl>
+    <w:lvl w:ilvl="8" w:tentative="1">
+      <w:start w:val="1"/>
+      <w:numFmt w:val="bullet"/>
+      <w:lvlText w:val=""/>
+      <w:lvlJc w:val="left"/>
+      <w:pPr>
+        <w:tabs>
+          <w:tab w:val="num" w:pos="6480"/>
+        </w:tabs>
+        <w:ind w:left="6480" w:hanging="360"/>
+      </w:pPr>
+      <w:rPr>
+        <w:rFonts w:ascii="Wingdings" w:hAnsi="Wingdings" w:hint="default"/>
+        <w:sz w:val="20"/>
+      </w:rPr>
+    </w:lvl>
+  </w:abstractNum>
   <w:num w:numId="1" w16cid:durableId="506021067">
     <w:abstractNumId w:val="8"/>
   </w:num>
@@ -1113,6 +1541,9 @@
   </w:num>
   <w:num w:numId="9" w16cid:durableId="38285287">
     <w:abstractNumId w:val="0"/>
+  </w:num>
+  <w:num w:numId="10" w16cid:durableId="663439379">
+    <w:abstractNumId w:val="9"/>
   </w:num>
 </w:numbering>
 </file>
@@ -12497,6 +12928,41 @@
       </w:tcPr>
     </w:tblStylePr>
   </w:style>
+  <w:style w:type="character" w:styleId="Hyperlink">
+    <w:name w:val="Hyperlink"/>
+    <w:basedOn w:val="DefaultParagraphFont"/>
+    <w:uiPriority w:val="99"/>
+    <w:unhideWhenUsed/>
+    <w:rsid w:val="00C9707B"/>
+    <w:rPr>
+      <w:color w:val="0000FF" w:themeColor="hyperlink"/>
+      <w:u w:val="single"/>
+    </w:rPr>
+  </w:style>
+  <w:style w:type="character" w:styleId="UnresolvedMention">
+    <w:name w:val="Unresolved Mention"/>
+    <w:basedOn w:val="DefaultParagraphFont"/>
+    <w:uiPriority w:val="99"/>
+    <w:semiHidden/>
+    <w:unhideWhenUsed/>
+    <w:rsid w:val="00C9707B"/>
+    <w:rPr>
+      <w:color w:val="605E5C"/>
+      <w:shd w:val="clear" w:color="auto" w:fill="E1DFDD"/>
+    </w:rPr>
+  </w:style>
+  <w:style w:type="character" w:styleId="FollowedHyperlink">
+    <w:name w:val="FollowedHyperlink"/>
+    <w:basedOn w:val="DefaultParagraphFont"/>
+    <w:uiPriority w:val="99"/>
+    <w:semiHidden/>
+    <w:unhideWhenUsed/>
+    <w:rsid w:val="00371D19"/>
+    <w:rPr>
+      <w:color w:val="800080" w:themeColor="followedHyperlink"/>
+      <w:u w:val="single"/>
+    </w:rPr>
+  </w:style>
 </w:styles>
 </file>
 

</xml_diff>